<commit_message>
Completar la afiliacion institucional en portada y metadatos
Faltaba el unico dato que no podia salir del repositorio ni deducirse: la
institucion y el programa. Universidad Invenio, carrera de Tecnologias de la
Informacion y Comunicacion Empresarial.

Se aplica en la portada del entregable con el formato que pide APA 7 —programa
o departamento, seguido de institucion— y en los metadatos del PRD, en su
version markdown y en la de Word, mas la cabecera del README.

Verificado sobre el .docx generado: cero marcadores COMPLETAR.

De paso el README quedaba desactualizado en dos puntos: no enlazaba el estudio
de w, h y granularidad, y seguia documentando solo el generador del PRD sin
mencionar el ensamblador, que es el que produce el entregable semanal.
</commit_message>
<xml_diff>
--- a/docs/PRD - Pronostico de Puntos de Inflexion LTC v1.0.docx
+++ b/docs/PRD - Pronostico de Puntos de Inflexion LTC v1.0.docx
@@ -427,6 +427,116 @@
                 <w:szCs w:val="20"/>
               </w:rPr>
               <w:t xml:space="preserve">Señales y Sistemas — 3.er Trimestre 2026</w:t>
+            </w:r>
+          </w:p>
+        </w:tc>
+      </w:tr>
+      <w:tr>
+        <w:tc>
+          <w:tcPr>
+            <w:tcW w:type="dxa" w:w="2400"/>
+            <w:tcMar>
+              <w:top w:type="dxa" w:w="110"/>
+              <w:left w:type="dxa" w:w="0"/>
+              <w:bottom w:type="dxa" w:w="110"/>
+              <w:right w:type="dxa" w:w="120"/>
+            </w:tcMar>
+          </w:tcPr>
+          <w:p>
+            <w:pPr>
+              <w:spacing w:after="0"/>
+            </w:pPr>
+            <w:r>
+              <w:rPr>
+                <w:rFonts w:ascii="Calibri" w:cs="Calibri" w:eastAsia="Calibri" w:hAnsi="Calibri"/>
+                <w:b/>
+                <w:bCs/>
+                <w:color w:val="5A6675"/>
+                <w:spacing w:val="20"/>
+                <w:sz w:val="16"/>
+                <w:szCs w:val="16"/>
+              </w:rPr>
+              <w:t xml:space="preserve">PROGRAMA</w:t>
+            </w:r>
+          </w:p>
+        </w:tc>
+        <w:tc>
+          <w:tcPr>
+            <w:tcW w:type="dxa" w:w="6960"/>
+            <w:tcMar>
+              <w:top w:type="dxa" w:w="110"/>
+              <w:left w:type="dxa" w:w="0"/>
+              <w:bottom w:type="dxa" w:w="110"/>
+              <w:right w:type="dxa" w:w="0"/>
+            </w:tcMar>
+          </w:tcPr>
+          <w:p>
+            <w:pPr>
+              <w:spacing w:after="0"/>
+            </w:pPr>
+            <w:r>
+              <w:rPr>
+                <w:rFonts w:ascii="Calibri" w:cs="Calibri" w:eastAsia="Calibri" w:hAnsi="Calibri"/>
+                <w:color w:val="20242B"/>
+                <w:sz w:val="20"/>
+                <w:szCs w:val="20"/>
+              </w:rPr>
+              <w:t xml:space="preserve">Tecnologías de la Información y Comunicación Empresarial</w:t>
+            </w:r>
+          </w:p>
+        </w:tc>
+      </w:tr>
+      <w:tr>
+        <w:tc>
+          <w:tcPr>
+            <w:tcW w:type="dxa" w:w="2400"/>
+            <w:tcMar>
+              <w:top w:type="dxa" w:w="110"/>
+              <w:left w:type="dxa" w:w="0"/>
+              <w:bottom w:type="dxa" w:w="110"/>
+              <w:right w:type="dxa" w:w="120"/>
+            </w:tcMar>
+          </w:tcPr>
+          <w:p>
+            <w:pPr>
+              <w:spacing w:after="0"/>
+            </w:pPr>
+            <w:r>
+              <w:rPr>
+                <w:rFonts w:ascii="Calibri" w:cs="Calibri" w:eastAsia="Calibri" w:hAnsi="Calibri"/>
+                <w:b/>
+                <w:bCs/>
+                <w:color w:val="5A6675"/>
+                <w:spacing w:val="20"/>
+                <w:sz w:val="16"/>
+                <w:szCs w:val="16"/>
+              </w:rPr>
+              <w:t xml:space="preserve">INSTITUCIÓN</w:t>
+            </w:r>
+          </w:p>
+        </w:tc>
+        <w:tc>
+          <w:tcPr>
+            <w:tcW w:type="dxa" w:w="6960"/>
+            <w:tcMar>
+              <w:top w:type="dxa" w:w="110"/>
+              <w:left w:type="dxa" w:w="0"/>
+              <w:bottom w:type="dxa" w:w="110"/>
+              <w:right w:type="dxa" w:w="0"/>
+            </w:tcMar>
+          </w:tcPr>
+          <w:p>
+            <w:pPr>
+              <w:spacing w:after="0"/>
+            </w:pPr>
+            <w:r>
+              <w:rPr>
+                <w:rFonts w:ascii="Calibri" w:cs="Calibri" w:eastAsia="Calibri" w:hAnsi="Calibri"/>
+                <w:color w:val="20242B"/>
+                <w:sz w:val="20"/>
+                <w:szCs w:val="20"/>
+              </w:rPr>
+              <w:t xml:space="preserve">Universidad Invenio</w:t>
             </w:r>
           </w:p>
         </w:tc>

</xml_diff>